<commit_message>
f1(lead): hợp nhất F1-IN + NV3 — questionnaire M27 sync key 2026 (grid NĐD/đơn vị), RT9 grid contract, r3b1 anchor 132->89, m12 census materialized, allowlist +38
Coverage: 85 IV / 11 BO (11 output-only chờ F1-OUT) / drift 0; excel 21+25+9+19 PASS; nv3 7+20 PASS
</commit_message>
<xml_diff>
--- a/app/templates/PLI_M48.docx
+++ b/app/templates/PLI_M48.docx
@@ -403,24 +403,23 @@
           <w:sz w:val="24"/>
           <w:sz-cs w:val="24"/>
         </w:rPr>
-        <w:t>về việc: {ve_viec} của (</w:t>
-      </w:r>
-      <w:r>
-        <w:rPr>
-          <w:rFonts w:ascii="Arial" w:hAnsi="Arial" w:cs="Arial"/>
-          <w:sz w:val="24"/>
-          <w:sz-cs w:val="24"/>
-          <w:i/>
-        </w:rPr>
-        <w:t>Tên doanh nghiệp</w:t>
-      </w:r>
-      <w:r>
-        <w:rPr>
-          <w:rFonts w:ascii="Arial" w:hAnsi="Arial" w:cs="Arial"/>
-          <w:sz w:val="24"/>
-          <w:sz-cs w:val="24"/>
-        </w:rPr>
-        <w:t>) ……………… Mã số doanh nghiệp (</w:t>
+        <w:t>về việc: {ve_viec} của {dn.ten_tieng_viet}</w:t>
+      </w:r>
+      <w:r>
+        <w:rPr>
+          <w:rFonts w:ascii="Arial" w:hAnsi="Arial" w:cs="Arial"/>
+          <w:sz w:val="24"/>
+          <w:sz-cs w:val="24"/>
+          <w:i/>
+        </w:rPr>
+      </w:r>
+      <w:r>
+        <w:rPr>
+          <w:rFonts w:ascii="Arial" w:hAnsi="Arial" w:cs="Arial"/>
+          <w:sz w:val="24"/>
+          <w:sz-cs w:val="24"/>
+        </w:rPr>
+        <w:t xml:space="preserve"> Mã số doanh nghiệp (</w:t>
       </w:r>
       <w:r>
         <w:rPr>

</xml_diff>